<commit_message>
GUI with cursor, MIMO, SMME, CE buttons
add slide window BER, EVM, SNRguard calcualtion, fix MIMO=0,1 modes (sum rx, eig mode). Add radio buttons for MIMOmode=0,1,2,3,4 CEmode=0 (HW),1 (SW), SMMSE mode (0, 1)
</commit_message>
<xml_diff>
--- a/sc_fdm_vs_ofdm.docx
+++ b/sc_fdm_vs_ofdm.docx
@@ -115,15 +115,7 @@
         </w:numPr>
       </w:pPr>
       <w:r>
-        <w:t xml:space="preserve">Rep=1,2,4 pilot with </w:t>
-      </w:r>
-      <w:proofErr w:type="spellStart"/>
-      <w:r>
-        <w:t>wifi</w:t>
-      </w:r>
-      <w:proofErr w:type="spellEnd"/>
-      <w:r>
-        <w:t xml:space="preserve"> tiny antenna</w:t>
+        <w:t>Rep=1,2,4 pilot with wifi tiny antenna</w:t>
       </w:r>
     </w:p>
     <w:p>
@@ -180,13 +172,8 @@
         </w:numPr>
       </w:pPr>
       <w:r>
-        <w:t xml:space="preserve">Long FM like </w:t>
-      </w:r>
-      <w:proofErr w:type="spellStart"/>
-      <w:r>
-        <w:t>anteanna</w:t>
-      </w:r>
-      <w:proofErr w:type="spellEnd"/>
+        <w:t>Long FM like anteanna</w:t>
+      </w:r>
     </w:p>
     <w:p>
       <w:pPr>
@@ -263,45 +250,8 @@
       </w:pPr>
       <w:r>
         <w:lastRenderedPageBreak/>
-        <w:t xml:space="preserve">My </w:t>
-      </w:r>
-      <w:proofErr w:type="spellStart"/>
-      <w:r>
-        <w:t>progamming</w:t>
-      </w:r>
-      <w:proofErr w:type="spellEnd"/>
-      <w:r>
-        <w:t xml:space="preserve"> experience consists of C, C++, </w:t>
-      </w:r>
-      <w:proofErr w:type="spellStart"/>
-      <w:r>
-        <w:t>Matlab</w:t>
-      </w:r>
-      <w:proofErr w:type="spellEnd"/>
-      <w:r>
-        <w:t xml:space="preserve">, Python, R languages. Recently I have been used Python the most. I used write code for CUDA, </w:t>
-      </w:r>
-      <w:proofErr w:type="spellStart"/>
-      <w:r>
-        <w:t>Matlab</w:t>
-      </w:r>
-      <w:proofErr w:type="spellEnd"/>
-      <w:r>
-        <w:t xml:space="preserve"> </w:t>
-      </w:r>
-      <w:proofErr w:type="spellStart"/>
-      <w:r>
-        <w:t>mex</w:t>
-      </w:r>
-      <w:proofErr w:type="spellEnd"/>
-      <w:r>
-        <w:t xml:space="preserve"> functions </w:t>
-      </w:r>
-      <w:proofErr w:type="spellStart"/>
-      <w:r>
-        <w:t>etc</w:t>
-      </w:r>
-      <w:proofErr w:type="spellEnd"/>
+        <w:t>My progamming experience consists of C, C++, Matlab, Python, R languages. Recently I have been used Python the most. I used write code for CUDA, Matlab mex functions etc</w:t>
+      </w:r>
     </w:p>
     <w:p>
       <w:pPr>
@@ -325,21 +275,8 @@
       <w:pPr>
         <w:pStyle w:val="ListParagraph"/>
       </w:pPr>
-      <w:proofErr w:type="spellStart"/>
-      <w:r>
-        <w:t>Cfo_set</w:t>
-      </w:r>
-      <w:proofErr w:type="spellEnd"/>
-      <w:r>
-        <w:t xml:space="preserve"> =0, </w:t>
-      </w:r>
-      <w:proofErr w:type="spellStart"/>
-      <w:r>
-        <w:t>cfo_est</w:t>
-      </w:r>
-      <w:proofErr w:type="spellEnd"/>
-      <w:r>
-        <w:t>=0, SNR=-3dB</w:t>
+      <w:r>
+        <w:t>Cfo_set =0, cfo_est=0, SNR=-3dB</w:t>
       </w:r>
     </w:p>
     <w:p>
@@ -388,21 +325,8 @@
       <w:pPr>
         <w:pStyle w:val="ListParagraph"/>
       </w:pPr>
-      <w:proofErr w:type="spellStart"/>
-      <w:r>
-        <w:t>Cfo_set</w:t>
-      </w:r>
-      <w:proofErr w:type="spellEnd"/>
-      <w:r>
-        <w:t xml:space="preserve">=0, </w:t>
-      </w:r>
-      <w:proofErr w:type="spellStart"/>
-      <w:r>
-        <w:t>cfo_est</w:t>
-      </w:r>
-      <w:proofErr w:type="spellEnd"/>
-      <w:r>
-        <w:t>=1, SNR=-3dB</w:t>
+      <w:r>
+        <w:t>Cfo_set=0, cfo_est=1, SNR=-3dB</w:t>
       </w:r>
     </w:p>
     <w:p>
@@ -452,15 +376,7 @@
         <w:pStyle w:val="ListParagraph"/>
       </w:pPr>
       <w:r>
-        <w:t xml:space="preserve">If there is no CFO, </w:t>
-      </w:r>
-      <w:proofErr w:type="spellStart"/>
-      <w:r>
-        <w:t>CFO_est</w:t>
-      </w:r>
-      <w:proofErr w:type="spellEnd"/>
-      <w:r>
-        <w:t xml:space="preserve"> leads to 3dB EVM degradation</w:t>
+        <w:t>If there is no CFO, CFO_est leads to 3dB EVM degradation</w:t>
       </w:r>
     </w:p>
     <w:p>
@@ -481,21 +397,11 @@
         <w:lastRenderedPageBreak/>
         <w:t xml:space="preserve">4time </w:t>
       </w:r>
-      <w:proofErr w:type="spellStart"/>
-      <w:r>
-        <w:t>preambule</w:t>
-      </w:r>
-      <w:proofErr w:type="spellEnd"/>
-      <w:r>
-        <w:t xml:space="preserve"> (FER @ SNR=-3 </w:t>
-      </w:r>
-      <w:proofErr w:type="spellStart"/>
-      <w:r>
-        <w:t>CFO_set</w:t>
-      </w:r>
-      <w:proofErr w:type="spellEnd"/>
-      <w:r>
-        <w:t>=0.001)</w:t>
+      <w:r>
+        <w:t>preamble</w:t>
+      </w:r>
+      <w:r>
+        <w:t xml:space="preserve"> (FER @ SNR=-3 CFO_set=0.001)</w:t>
       </w:r>
     </w:p>
     <w:p>
@@ -504,9 +410,9 @@
       </w:pPr>
       <w:r>
         <w:drawing>
-          <wp:inline distT="0" distB="0" distL="0" distR="0" wp14:anchorId="303EAA7B" wp14:editId="13FD92B3">
-            <wp:extent cx="5799323" cy="4092295"/>
-            <wp:effectExtent l="0" t="0" r="0" b="3810"/>
+          <wp:inline distT="0" distB="0" distL="0" distR="0" wp14:anchorId="303EAA7B" wp14:editId="6EFE9608">
+            <wp:extent cx="4511040" cy="3183217"/>
+            <wp:effectExtent l="0" t="0" r="3810" b="0"/>
             <wp:docPr id="922211497" name="Picture 1" descr="A graph of a graph of a number of different colored lines&#10;&#10;AI-generated content may be incorrect."/>
             <wp:cNvGraphicFramePr>
               <a:graphicFrameLocks xmlns:a="http://schemas.openxmlformats.org/drawingml/2006/main" noChangeAspect="1"/>
@@ -527,7 +433,7 @@
                   <pic:spPr>
                     <a:xfrm>
                       <a:off x="0" y="0"/>
-                      <a:ext cx="5799323" cy="4092295"/>
+                      <a:ext cx="4515496" cy="3186362"/>
                     </a:xfrm>
                     <a:prstGeom prst="rect">
                       <a:avLst/>
@@ -540,6 +446,125 @@
         </w:drawing>
       </w:r>
     </w:p>
+    <w:p>
+      <w:pPr>
+        <w:pStyle w:val="ListParagraph"/>
+      </w:pPr>
+      <w:r>
+        <w:t>1time preamble (FER @ SNR=-3 CFO_set=0.001)</w:t>
+      </w:r>
+    </w:p>
+    <w:p>
+      <w:pPr>
+        <w:pStyle w:val="ListParagraph"/>
+      </w:pPr>
+      <w:r>
+        <w:drawing>
+          <wp:inline distT="0" distB="0" distL="0" distR="0" wp14:anchorId="43C8A137" wp14:editId="74AA32E1">
+            <wp:extent cx="4232938" cy="3025140"/>
+            <wp:effectExtent l="0" t="0" r="0" b="3810"/>
+            <wp:docPr id="863139707" name="Picture 1" descr="A graph with numbers and lines"/>
+            <wp:cNvGraphicFramePr>
+              <a:graphicFrameLocks xmlns:a="http://schemas.openxmlformats.org/drawingml/2006/main" noChangeAspect="1"/>
+            </wp:cNvGraphicFramePr>
+            <a:graphic xmlns:a="http://schemas.openxmlformats.org/drawingml/2006/main">
+              <a:graphicData uri="http://schemas.openxmlformats.org/drawingml/2006/picture">
+                <pic:pic xmlns:pic="http://schemas.openxmlformats.org/drawingml/2006/picture">
+                  <pic:nvPicPr>
+                    <pic:cNvPr id="863139707" name="Picture 1" descr="A graph with numbers and lines"/>
+                    <pic:cNvPicPr/>
+                  </pic:nvPicPr>
+                  <pic:blipFill>
+                    <a:blip r:embed="rId12"/>
+                    <a:stretch>
+                      <a:fillRect/>
+                    </a:stretch>
+                  </pic:blipFill>
+                  <pic:spPr>
+                    <a:xfrm>
+                      <a:off x="0" y="0"/>
+                      <a:ext cx="4242384" cy="3031891"/>
+                    </a:xfrm>
+                    <a:prstGeom prst="rect">
+                      <a:avLst/>
+                    </a:prstGeom>
+                  </pic:spPr>
+                </pic:pic>
+              </a:graphicData>
+            </a:graphic>
+          </wp:inline>
+        </w:drawing>
+      </w:r>
+    </w:p>
+    <w:p>
+      <w:r>
+        <w:br w:type="page"/>
+      </w:r>
+    </w:p>
+    <w:p>
+      <w:pPr>
+        <w:pStyle w:val="ListParagraph"/>
+      </w:pPr>
+      <w:r>
+        <w:lastRenderedPageBreak/>
+        <w:t>2 time preamble (</w:t>
+      </w:r>
+    </w:p>
+    <w:p>
+      <w:pPr>
+        <w:pStyle w:val="ListParagraph"/>
+      </w:pPr>
+      <w:r>
+        <w:drawing>
+          <wp:inline distT="0" distB="0" distL="0" distR="0" wp14:anchorId="21B13E01" wp14:editId="52C11CC8">
+            <wp:extent cx="3339358" cy="2400300"/>
+            <wp:effectExtent l="0" t="0" r="0" b="0"/>
+            <wp:docPr id="79223226" name="Picture 1">
+              <a:extLst xmlns:a="http://schemas.openxmlformats.org/drawingml/2006/main">
+                <a:ext uri="{C183D7F6-B498-43B3-948B-1728B52AA6E4}">
+                  <adec:decorative xmlns:adec="http://schemas.microsoft.com/office/drawing/2017/decorative" val="0"/>
+                </a:ext>
+              </a:extLst>
+            </wp:docPr>
+            <wp:cNvGraphicFramePr>
+              <a:graphicFrameLocks xmlns:a="http://schemas.openxmlformats.org/drawingml/2006/main" noChangeAspect="1"/>
+            </wp:cNvGraphicFramePr>
+            <a:graphic xmlns:a="http://schemas.openxmlformats.org/drawingml/2006/main">
+              <a:graphicData uri="http://schemas.openxmlformats.org/drawingml/2006/picture">
+                <pic:pic xmlns:pic="http://schemas.openxmlformats.org/drawingml/2006/picture">
+                  <pic:nvPicPr>
+                    <pic:cNvPr id="79223226" name="Picture 1">
+                      <a:extLst>
+                        <a:ext uri="{C183D7F6-B498-43B3-948B-1728B52AA6E4}">
+                          <adec:decorative xmlns:adec="http://schemas.microsoft.com/office/drawing/2017/decorative" val="0"/>
+                        </a:ext>
+                      </a:extLst>
+                    </pic:cNvPr>
+                    <pic:cNvPicPr/>
+                  </pic:nvPicPr>
+                  <pic:blipFill>
+                    <a:blip r:embed="rId13"/>
+                    <a:stretch>
+                      <a:fillRect/>
+                    </a:stretch>
+                  </pic:blipFill>
+                  <pic:spPr>
+                    <a:xfrm>
+                      <a:off x="0" y="0"/>
+                      <a:ext cx="3340434" cy="2401074"/>
+                    </a:xfrm>
+                    <a:prstGeom prst="rect">
+                      <a:avLst/>
+                    </a:prstGeom>
+                  </pic:spPr>
+                </pic:pic>
+              </a:graphicData>
+            </a:graphic>
+          </wp:inline>
+        </w:drawing>
+      </w:r>
+    </w:p>
+    <w:p/>
     <w:sectPr>
       <w:pgSz w:w="12240" w:h="15840"/>
       <w:pgMar w:top="1440" w:right="1440" w:bottom="1440" w:left="1440" w:header="708" w:footer="708" w:gutter="0"/>
@@ -1564,6 +1589,16 @@
       <w:spacing w:val="5"/>
     </w:rPr>
   </w:style>
+  <w:style w:type="character" w:styleId="PlaceholderText">
+    <w:name w:val="Placeholder Text"/>
+    <w:basedOn w:val="DefaultParagraphFont"/>
+    <w:uiPriority w:val="99"/>
+    <w:semiHidden/>
+    <w:rsid w:val="004D5A9A"/>
+    <w:rPr>
+      <w:color w:val="666666"/>
+    </w:rPr>
+  </w:style>
 </w:styles>
 </file>
 

</xml_diff>